<commit_message>
feat: add puppeteer launch helper, consolidate seed files, update templates
</commit_message>
<xml_diff>
--- a/testlab-backend/src/documents/templates/word/fsd_word_template.docx
+++ b/testlab-backend/src/documents/templates/word/fsd_word_template.docx
@@ -2927,7 +2927,7 @@
         <w:t>3. Objectif</w:t>
       </w:r>
     </w:p>
-    <w:p xmlns:wp14="http://schemas.microsoft.com/office/word/2010/wordml" wp14:textId="77777777">
+    <w:p xmlns:wp14="http://schemas.microsoft.com/office/word/2010/wordml" wp14:textId="07C58DBC">
       <w:pPr>
         <w:spacing w:before="40" w:after="40"/>
         <w:rPr>
@@ -2947,7 +2947,7 @@
           <w:sz w:val="24"/>
           <w:szCs w:val="24"/>
         </w:rPr>
-        <w:t>introduction.purpose</w:t>
+        <w:t>objective</w:t>
       </w:r>
       <w:r>
         <w:rPr>
@@ -4124,13 +4124,136 @@
         <w:t xml:space="preserve">  {title}</w:t>
       </w:r>
     </w:p>
-    <w:p xmlns:wp14="http://schemas.microsoft.com/office/word/2010/wordml" wp14:textId="77777777">
+    <w:p>
+      <w:pPr>
+        <w:pStyle w:val="Normal"/>
+        <w:spacing w:before="80"/>
+        <w:ind w:left="454"/>
+        <w:jc w:val="center"/>
+        <w:rPr>
+          <w:rFonts w:ascii="Consolas" w:hAnsi="Consolas" w:eastAsia="Consolas" w:cs="Consolas"/>
+          <w:b w:val="0"/>
+          <w:bCs w:val="0"/>
+          <w:i w:val="0"/>
+          <w:iCs w:val="0"/>
+          <w:caps w:val="0"/>
+          <w:smallCaps w:val="0"/>
+          <w:noProof w:val="0"/>
+          <w:color w:val="auto"/>
+          <w:sz w:val="24"/>
+          <w:szCs w:val="24"/>
+          <w:lang w:val="en-US"/>
+        </w:rPr>
+      </w:pPr>
+      <w:r>
+        <w:rPr>
+          <w:rFonts w:ascii="Consolas" w:hAnsi="Consolas" w:eastAsia="Consolas" w:cs="Consolas"/>
+          <w:b w:val="0"/>
+          <w:bCs w:val="0"/>
+          <w:i w:val="0"/>
+          <w:iCs w:val="0"/>
+          <w:caps w:val="0"/>
+          <w:smallCaps w:val="0"/>
+          <w:noProof w:val="0"/>
+          <w:color w:val="auto"/>
+          <w:sz w:val="24"/>
+          <w:szCs w:val="24"/>
+          <w:lang w:val="en-US"/>
+        </w:rPr>
+        <w:t>{#images}</w:t>
+      </w:r>
+      <w:r>
+        <w:br/>
+      </w:r>
+      <w:r>
+        <w:rPr>
+          <w:rFonts w:ascii="Consolas" w:hAnsi="Consolas" w:eastAsia="Consolas" w:cs="Consolas"/>
+          <w:b w:val="0"/>
+          <w:bCs w:val="0"/>
+          <w:i w:val="0"/>
+          <w:iCs w:val="0"/>
+          <w:caps w:val="0"/>
+          <w:smallCaps w:val="0"/>
+          <w:noProof w:val="0"/>
+          <w:color w:val="auto"/>
+          <w:sz w:val="24"/>
+          <w:szCs w:val="24"/>
+          <w:lang w:val="en-US"/>
+        </w:rPr>
+        <w:t xml:space="preserve">  {%image}</w:t>
+      </w:r>
+      <w:r>
+        <w:br/>
+      </w:r>
+      <w:r>
+        <w:rPr>
+          <w:rFonts w:ascii="Consolas" w:hAnsi="Consolas" w:eastAsia="Consolas" w:cs="Consolas"/>
+          <w:b w:val="0"/>
+          <w:bCs w:val="0"/>
+          <w:i w:val="0"/>
+          <w:iCs w:val="0"/>
+          <w:caps w:val="0"/>
+          <w:smallCaps w:val="0"/>
+          <w:noProof w:val="0"/>
+          <w:color w:val="0F1115"/>
+          <w:sz w:val="19"/>
+          <w:szCs w:val="19"/>
+          <w:lang w:val="en-US"/>
+        </w:rPr>
+        <w:t>Figure {figureNumber} : {figureTitle}</w:t>
+      </w:r>
+      <w:r>
+        <w:br/>
+      </w:r>
+      <w:r>
+        <w:br/>
+      </w:r>
+      <w:r>
+        <w:rPr>
+          <w:rFonts w:ascii="Consolas" w:hAnsi="Consolas" w:eastAsia="Consolas" w:cs="Consolas"/>
+          <w:b w:val="0"/>
+          <w:bCs w:val="0"/>
+          <w:i w:val="0"/>
+          <w:iCs w:val="0"/>
+          <w:caps w:val="0"/>
+          <w:smallCaps w:val="0"/>
+          <w:noProof w:val="0"/>
+          <w:color w:val="auto"/>
+          <w:sz w:val="24"/>
+          <w:szCs w:val="24"/>
+          <w:lang w:val="en-US"/>
+        </w:rPr>
+        <w:t>{/images}</w:t>
+      </w:r>
+    </w:p>
+    <w:p>
+      <w:pPr>
+        <w:pStyle w:val="Normal"/>
+      </w:pPr>
+      <w:r>
+        <w:rPr/>
+        <w:t>Détails</w:t>
+      </w:r>
+      <w:r>
+        <w:rPr/>
+        <w:t xml:space="preserve"> de la User Story</w:t>
+      </w:r>
+    </w:p>
+    <w:p>
+      <w:pPr>
+        <w:pStyle w:val="Normal"/>
+      </w:pPr>
+      <w:r>
+        <w:rPr>
+          <w:rStyle w:val="Strong"/>
+        </w:rPr>
+        <w:t>Description</w:t>
+      </w:r>
+    </w:p>
+    <w:p>
       <w:pPr>
         <w:spacing w:before="20" w:after="20"/>
         <w:ind w:left="454"/>
-        <w:pBdr>
-          <w:left w:val="single" w:color="DCE8F5" w:sz="12" w:space="6"/>
-        </w:pBdr>
         <w:rPr>
           <w:color w:val="auto"/>
           <w:sz w:val="24"/>
@@ -4189,18 +4312,29 @@
     </w:p>
     <w:p>
       <w:pPr>
+        <w:pStyle w:val="Normal"/>
         <w:spacing w:before="60" w:after="20"/>
         <w:ind w:left="454"/>
         <w:rPr>
-          <w:b w:val="1"/>
-          <w:bCs w:val="1"/>
+          <w:b w:val="0"/>
+          <w:bCs w:val="0"/>
           <w:color w:val="auto"/>
           <w:sz w:val="24"/>
           <w:szCs w:val="24"/>
         </w:rPr>
       </w:pPr>
+      <w:r>
+        <w:rPr>
+          <w:b w:val="0"/>
+          <w:bCs w:val="0"/>
+          <w:color w:val="auto"/>
+          <w:sz w:val="24"/>
+          <w:szCs w:val="24"/>
+        </w:rPr>
+        <w:t>•{criteredescription}</w:t>
+      </w:r>
     </w:p>
-    <w:p xmlns:wp14="http://schemas.microsoft.com/office/word/2010/wordml" wp14:textId="4E58617A">
+    <w:p xmlns:wp14="http://schemas.microsoft.com/office/word/2010/wordml" wp14:textId="086948B9">
       <w:pPr>
         <w:pStyle w:val="Normal"/>
         <w:spacing w:before="60" w:after="20"/>
@@ -4224,7 +4358,7 @@
           <w:sz w:val="24"/>
           <w:szCs w:val="24"/>
         </w:rPr>
-        <w:t xml:space="preserve">• </w:t>
+        <w:t xml:space="preserve"> </w:t>
       </w:r>
       <w:r>
         <w:rPr>
@@ -4329,196 +4463,6 @@
           <w:szCs w:val="24"/>
         </w:rPr>
         <w:t>{/acceptanceCriteria}</w:t>
-      </w:r>
-    </w:p>
-    <w:p xmlns:wp14="http://schemas.microsoft.com/office/word/2010/wordml" wp14:textId="54396846">
-      <w:pPr>
-        <w:pStyle w:val="Normal"/>
-        <w:spacing w:before="80"/>
-        <w:ind w:left="454"/>
-        <w:pBdr>
-          <w:left w:val="single" w:color="DCE8F5" w:sz="12" w:space="6"/>
-        </w:pBdr>
-        <w:jc w:val="center"/>
-        <w:rPr>
-          <w:rFonts w:ascii="Consolas" w:hAnsi="Consolas" w:eastAsia="Consolas" w:cs="Consolas"/>
-          <w:b w:val="0"/>
-          <w:bCs w:val="0"/>
-          <w:i w:val="0"/>
-          <w:iCs w:val="0"/>
-          <w:caps w:val="0"/>
-          <w:smallCaps w:val="0"/>
-          <w:noProof w:val="0"/>
-          <w:color w:val="auto"/>
-          <w:sz w:val="24"/>
-          <w:szCs w:val="24"/>
-          <w:lang w:val="en-US"/>
-        </w:rPr>
-      </w:pPr>
-      <w:r>
-        <w:rPr>
-          <w:rFonts w:ascii="Consolas" w:hAnsi="Consolas" w:eastAsia="Consolas" w:cs="Consolas"/>
-          <w:b w:val="0"/>
-          <w:bCs w:val="0"/>
-          <w:i w:val="0"/>
-          <w:iCs w:val="0"/>
-          <w:caps w:val="0"/>
-          <w:smallCaps w:val="0"/>
-          <w:noProof w:val="0"/>
-          <w:color w:val="auto"/>
-          <w:sz w:val="24"/>
-          <w:szCs w:val="24"/>
-          <w:lang w:val="en-US"/>
-        </w:rPr>
-        <w:t>{#images}</w:t>
-      </w:r>
-      <w:r>
-        <w:br/>
-      </w:r>
-      <w:r>
-        <w:rPr>
-          <w:rFonts w:ascii="Consolas" w:hAnsi="Consolas" w:eastAsia="Consolas" w:cs="Consolas"/>
-          <w:b w:val="0"/>
-          <w:bCs w:val="0"/>
-          <w:i w:val="0"/>
-          <w:iCs w:val="0"/>
-          <w:caps w:val="0"/>
-          <w:smallCaps w:val="0"/>
-          <w:noProof w:val="0"/>
-          <w:color w:val="auto"/>
-          <w:sz w:val="24"/>
-          <w:szCs w:val="24"/>
-          <w:lang w:val="en-US"/>
-        </w:rPr>
-        <w:t xml:space="preserve">  {%image}</w:t>
-      </w:r>
-      <w:r>
-        <w:br/>
-      </w:r>
-      <w:r>
-        <w:rPr>
-          <w:rFonts w:ascii="Consolas" w:hAnsi="Consolas" w:eastAsia="Consolas" w:cs="Consolas"/>
-          <w:b w:val="0"/>
-          <w:bCs w:val="0"/>
-          <w:i w:val="0"/>
-          <w:iCs w:val="0"/>
-          <w:caps w:val="0"/>
-          <w:smallCaps w:val="0"/>
-          <w:noProof w:val="0"/>
-          <w:color w:val="0F1115"/>
-          <w:sz w:val="19"/>
-          <w:szCs w:val="19"/>
-          <w:lang w:val="en-US"/>
-        </w:rPr>
-        <w:t>Figure {</w:t>
-      </w:r>
-      <w:r>
-        <w:rPr>
-          <w:rFonts w:ascii="Consolas" w:hAnsi="Consolas" w:eastAsia="Consolas" w:cs="Consolas"/>
-          <w:b w:val="0"/>
-          <w:bCs w:val="0"/>
-          <w:i w:val="0"/>
-          <w:iCs w:val="0"/>
-          <w:caps w:val="0"/>
-          <w:smallCaps w:val="0"/>
-          <w:noProof w:val="0"/>
-          <w:color w:val="0F1115"/>
-          <w:sz w:val="19"/>
-          <w:szCs w:val="19"/>
-          <w:lang w:val="en-US"/>
-        </w:rPr>
-        <w:t>figureNumber</w:t>
-      </w:r>
-      <w:r>
-        <w:rPr>
-          <w:rFonts w:ascii="Consolas" w:hAnsi="Consolas" w:eastAsia="Consolas" w:cs="Consolas"/>
-          <w:b w:val="0"/>
-          <w:bCs w:val="0"/>
-          <w:i w:val="0"/>
-          <w:iCs w:val="0"/>
-          <w:caps w:val="0"/>
-          <w:smallCaps w:val="0"/>
-          <w:noProof w:val="0"/>
-          <w:color w:val="0F1115"/>
-          <w:sz w:val="19"/>
-          <w:szCs w:val="19"/>
-          <w:lang w:val="en-US"/>
-        </w:rPr>
-        <w:t>} :</w:t>
-      </w:r>
-      <w:r>
-        <w:rPr>
-          <w:rFonts w:ascii="Consolas" w:hAnsi="Consolas" w:eastAsia="Consolas" w:cs="Consolas"/>
-          <w:b w:val="0"/>
-          <w:bCs w:val="0"/>
-          <w:i w:val="0"/>
-          <w:iCs w:val="0"/>
-          <w:caps w:val="0"/>
-          <w:smallCaps w:val="0"/>
-          <w:noProof w:val="0"/>
-          <w:color w:val="0F1115"/>
-          <w:sz w:val="19"/>
-          <w:szCs w:val="19"/>
-          <w:lang w:val="en-US"/>
-        </w:rPr>
-        <w:t xml:space="preserve"> {</w:t>
-      </w:r>
-      <w:r>
-        <w:rPr>
-          <w:rFonts w:ascii="Consolas" w:hAnsi="Consolas" w:eastAsia="Consolas" w:cs="Consolas"/>
-          <w:b w:val="0"/>
-          <w:bCs w:val="0"/>
-          <w:i w:val="0"/>
-          <w:iCs w:val="0"/>
-          <w:caps w:val="0"/>
-          <w:smallCaps w:val="0"/>
-          <w:noProof w:val="0"/>
-          <w:color w:val="0F1115"/>
-          <w:sz w:val="19"/>
-          <w:szCs w:val="19"/>
-          <w:lang w:val="en-US"/>
-        </w:rPr>
-        <w:t>figureTitle</w:t>
-      </w:r>
-      <w:r>
-        <w:rPr>
-          <w:rFonts w:ascii="Consolas" w:hAnsi="Consolas" w:eastAsia="Consolas" w:cs="Consolas"/>
-          <w:b w:val="0"/>
-          <w:bCs w:val="0"/>
-          <w:i w:val="0"/>
-          <w:iCs w:val="0"/>
-          <w:caps w:val="0"/>
-          <w:smallCaps w:val="0"/>
-          <w:noProof w:val="0"/>
-          <w:color w:val="0F1115"/>
-          <w:sz w:val="19"/>
-          <w:szCs w:val="19"/>
-          <w:lang w:val="en-US"/>
-        </w:rPr>
-        <w:t>}</w:t>
-      </w:r>
-      <w:r>
-        <w:br/>
-      </w:r>
-      <w:r>
-        <w:br/>
-      </w:r>
-      <w:r>
-        <w:rPr>
-          <w:rFonts w:ascii="Consolas" w:hAnsi="Consolas" w:eastAsia="Consolas" w:cs="Consolas"/>
-          <w:b w:val="0"/>
-          <w:bCs w:val="0"/>
-          <w:i w:val="0"/>
-          <w:iCs w:val="0"/>
-          <w:caps w:val="0"/>
-          <w:smallCaps w:val="0"/>
-          <w:noProof w:val="0"/>
-          <w:color w:val="auto"/>
-          <w:sz w:val="24"/>
-          <w:szCs w:val="24"/>
-          <w:lang w:val="en-US"/>
-        </w:rPr>
-        <w:t>{/images}</w:t>
       </w:r>
     </w:p>
     <w:p>
@@ -6297,8 +6241,9 @@
     <w:name w:val="Strong"/>
     <w:basedOn w:val="DefaultParagraphFont"/>
     <w:qFormat/>
-    <w:rsid w:val="281DDC2A"/>
+    <w:rsid w:val="573700E2"/>
     <w:rPr>
+      <w:rFonts w:ascii="Cambria" w:hAnsi="Cambria" w:eastAsia="ＭＳ 明朝" w:cs="" w:asciiTheme="minorAscii" w:hAnsiTheme="minorAscii" w:eastAsiaTheme="minorEastAsia" w:cstheme="minorBidi"/>
       <w:b w:val="1"/>
       <w:bCs w:val="1"/>
       <w:color w:val="auto"/>

</xml_diff>

<commit_message>
implementation of cloudinary for fsd image rendering
</commit_message>
<xml_diff>
--- a/testlab-backend/src/documents/templates/word/fsd_word_template.docx
+++ b/testlab-backend/src/documents/templates/word/fsd_word_template.docx
@@ -4334,7 +4334,7 @@
         <w:t>•{criteredescription}</w:t>
       </w:r>
     </w:p>
-    <w:p xmlns:wp14="http://schemas.microsoft.com/office/word/2010/wordml" wp14:textId="086948B9">
+    <w:p xmlns:wp14="http://schemas.microsoft.com/office/word/2010/wordml" wp14:textId="5B82BA31">
       <w:pPr>
         <w:pStyle w:val="Normal"/>
         <w:spacing w:before="60" w:after="20"/>
@@ -4350,16 +4350,6 @@
           <w:szCs w:val="24"/>
         </w:rPr>
       </w:pPr>
-      <w:r>
-        <w:rPr>
-          <w:b w:val="0"/>
-          <w:bCs w:val="0"/>
-          <w:color w:val="auto"/>
-          <w:sz w:val="24"/>
-          <w:szCs w:val="24"/>
-        </w:rPr>
-        <w:t xml:space="preserve"> </w:t>
-      </w:r>
       <w:r>
         <w:rPr>
           <w:b w:val="0"/>

</xml_diff>

<commit_message>
feat: update document templates and fix Word generation
</commit_message>
<xml_diff>
--- a/testlab-backend/src/documents/templates/word/fsd_word_template.docx
+++ b/testlab-backend/src/documents/templates/word/fsd_word_template.docx
@@ -4334,7 +4334,7 @@
         <w:t>•{criteredescription}</w:t>
       </w:r>
     </w:p>
-    <w:p xmlns:wp14="http://schemas.microsoft.com/office/word/2010/wordml" wp14:textId="5B82BA31">
+    <w:p xmlns:wp14="http://schemas.microsoft.com/office/word/2010/wordml" wp14:textId="086948B9">
       <w:pPr>
         <w:pStyle w:val="Normal"/>
         <w:spacing w:before="60" w:after="20"/>
@@ -4350,6 +4350,16 @@
           <w:szCs w:val="24"/>
         </w:rPr>
       </w:pPr>
+      <w:r>
+        <w:rPr>
+          <w:b w:val="0"/>
+          <w:bCs w:val="0"/>
+          <w:color w:val="auto"/>
+          <w:sz w:val="24"/>
+          <w:szCs w:val="24"/>
+        </w:rPr>
+        <w:t xml:space="preserve"> </w:t>
+      </w:r>
       <w:r>
         <w:rPr>
           <w:b w:val="0"/>

</xml_diff>